<commit_message>
feat: incorporate security, integrity, and municipal corrections from audit review
</commit_message>
<xml_diff>
--- a/capítulos/CAPÍTULO III.docx
+++ b/capítulos/CAPÍTULO III.docx
@@ -4,6 +4,11 @@
   <w:body>
     <w:bookmarkEnd w:id="3"/>
     <w:p>
+      <w:r>
+        <w:t>Versión de trabajo revisada el 3 de octubre de 2026. La propuesta se centra en integrar y dar seguimiento a procedimientos existentes. El diagnóstico inicial de 2023 es antecedente histórico: el informe final de la consultoría documenta la elaboración de herramientas administrativas y capacitación. La membresía activa para el proyecto corresponde a San Pedro Soloma, Santa Eulalia y San Rafael la Independencia, confirmada por el responsable el 3 de octubre de 2026 a partir del PG. El padrón de participantes y los resultados pretest/postest requieren confirmación y evidencia institucional. Este documento no acredita esas mediciones.</w:t>
+      </w:r>
+    </w:p>
+    <w:p>
       <w:pPr>
         <w:pStyle w:val="Ttulo1"/>
         <w:spacing w:line="360" w:lineRule="auto" w:before="360" w:after="240"/>
@@ -55,6 +60,9 @@
         <w:spacing w:line="360" w:lineRule="auto" w:before="280" w:after="120"/>
         <w:ind w:firstLine="0"/>
         <w:jc w:val="left"/>
+        <w:numPr>
+          <w:numId w:val="0"/>
+        </w:numPr>
       </w:pPr>
       <w:r>
         <w:rPr>
@@ -85,6 +93,9 @@
         <w:spacing w:line="360" w:lineRule="auto" w:before="200" w:after="80"/>
         <w:ind w:firstLine="0"/>
         <w:jc w:val="left"/>
+        <w:numPr>
+          <w:numId w:val="0"/>
+        </w:numPr>
       </w:pPr>
       <w:r>
         <w:rPr>
@@ -143,6 +154,9 @@
         <w:spacing w:line="360" w:lineRule="auto" w:before="200" w:after="80"/>
         <w:ind w:firstLine="0"/>
         <w:jc w:val="left"/>
+        <w:numPr>
+          <w:numId w:val="0"/>
+        </w:numPr>
       </w:pPr>
       <w:r>
         <w:rPr>
@@ -187,6 +201,9 @@
         <w:spacing w:line="360" w:lineRule="auto" w:before="280" w:after="120"/>
         <w:ind w:firstLine="0"/>
         <w:jc w:val="left"/>
+        <w:numPr>
+          <w:numId w:val="0"/>
+        </w:numPr>
       </w:pPr>
       <w:r>
         <w:rPr>
@@ -217,6 +234,9 @@
         <w:spacing w:line="360" w:lineRule="auto" w:before="200" w:after="80"/>
         <w:ind w:firstLine="0"/>
         <w:jc w:val="left"/>
+        <w:numPr>
+          <w:numId w:val="0"/>
+        </w:numPr>
       </w:pPr>
       <w:r>
         <w:rPr>
@@ -262,11 +282,7 @@
         <w:jc w:val="both"/>
       </w:pPr>
       <w:r>
-        <w:rPr>
-          <w:rFonts w:ascii="Times New Roman" w:hAnsi="Times New Roman"/>
-          <w:sz w:val="24"/>
-        </w:rPr>
-        <w:t>En tercer lugar, la investigación adquiere un alcance explicativo sustancial. Arias (2012) señala que la investigación explicativa se encarga de buscar el porqué de los hechos mediante el establecimiento de relaciones de causa-efecto entre las variables objeto de estudio. En este proyecto no solo se describe el funcionamiento de los procesos administrativos y la tecnología construida, sino que se demuestra y explica de qué manera la introducción de la plataforma informática centralizada y la arquitectura multiservicio en la nube (variable independiente) causa directamente la optimización de los tiempos de procesamiento, la salvaguarda de la seguridad de la información y la elevación de la eficiencia en la toma de decisiones gerenciales dentro de la administración general (variable dependiente).</w:t>
+        <w:t>La investigación busca analizar la relación entre la introducción de la plataforma y los cambios observados en tiempos, seguridad de la información y apoyo a las decisiones. El diseño preexperimental de un solo grupo permite comparar mediciones antes y después, pero no aislar causalmente el efecto de la plataforma de factores como capacitación, cambios de personal, aprendizaje o variaciones en las tareas. Las conclusiones deberán reconocer estas limitaciones.</w:t>
       </w:r>
     </w:p>
     <w:p>
@@ -275,6 +291,9 @@
         <w:spacing w:line="360" w:lineRule="auto" w:before="200" w:after="80"/>
         <w:ind w:firstLine="0"/>
         <w:jc w:val="left"/>
+        <w:numPr>
+          <w:numId w:val="0"/>
+        </w:numPr>
       </w:pPr>
       <w:r>
         <w:rPr>
@@ -296,7 +315,7 @@
           <w:rFonts w:ascii="Times New Roman" w:hAnsi="Times New Roman"/>
           <w:sz w:val="24"/>
         </w:rPr>
-        <w:t>Para responder satisfactoriamente a las preguntas de investigación y someter a prueba la hipótesis planteada, se implementa un diseño metodológico estructurado en dos vertientes complementarias: un diseño cuasi-experimental con preprueba y posprueba para un solo grupo representativo, y un diseño no experimental transversal descriptivo. Esta configuración metodológica permite combinar la contrastación estadística de rendimiento antes y después de la intervención tecnológica con la evaluación estandarizada de la percepción usuaria una vez alcanzada la estabilización del ecosistema informático.</w:t>
+        <w:t>Para responder satisfactoriamente a las preguntas de investigación y someter a prueba la hipótesis planteada, se implementa un diseño metodológico estructurado en dos vertientes complementarias: un diseño pre-experimental con preprueba y posprueba para un solo grupo representativo, y un diseño no experimental transversal descriptivo. Esta configuración metodológica permite combinar la contrastación estadística de rendimiento antes y después de la intervención tecnológica con la evaluación estandarizada de la percepción usuaria una vez alcanzada la estabilización del ecosistema informático.</w:t>
       </w:r>
     </w:p>
     <w:p>
@@ -310,7 +329,7 @@
           <w:rFonts w:ascii="Times New Roman" w:hAnsi="Times New Roman"/>
           <w:sz w:val="24"/>
         </w:rPr>
-        <w:t>La vertiente principal se fundamenta en un diseño cuasi-experimental (o pre-experimental de grupo único con medición pretest y postest), simbolizado formalmente bajo la notación metodológica clásica como O1 -&gt; X -&gt; O2. En este esquema, O1 representa la observación basal inicial (pretest), consistente en el registro cronométrico y documental de los tiempos de procesamiento, tasas de error y horas dedicadas a la reportería bajo la modalidad operativa tradicional (manual, papel y hojas de cálculo). El componente X simboliza el estímulo o tratamiento experimental, constituido por la implantación formal del ecosistema web en la nube y la capacitación intensiva de los operadores. Finalmente, O2 representa la observación posterior (postest), en la cual se recolectan de forma automatizada e independiente las mismas métricas de tiempo y rendimiento a través de las bitácoras del sistema, permitiendo comparar estadísticamente si los cambios observados resultan significativos.</w:t>
+        <w:t>La vertiente principal se fundamenta en un diseño pre-experimental de grupo único con medición pretest y postest, simbolizado formalmente bajo la notación metodológica clásica como O1 -&gt; X -&gt; O2. En este esquema, O1 representa la observación basal inicial (pretest), consistente en el registro cronométrico y documental de los tiempos de procesamiento, tasas de error y horas dedicadas a la reportería bajo la modalidad operativa tradicional (manual, papel y hojas de cálculo). El componente X simboliza el estímulo o tratamiento experimental, constituido por la implantación formal del ecosistema web en la nube y la capacitación intensiva de los operadores. Finalmente, O2 representa la observación posterior (postest), en la cual se recolectan de forma automatizada e independiente las mismas métricas de tiempo y rendimiento a través de las bitácoras del sistema, permitiendo comparar estadísticamente si los cambios observados resultan significativos.</w:t>
       </w:r>
     </w:p>
     <w:p>
@@ -333,6 +352,9 @@
         <w:spacing w:line="360" w:lineRule="auto" w:before="280" w:after="120"/>
         <w:ind w:firstLine="0"/>
         <w:jc w:val="left"/>
+        <w:numPr>
+          <w:numId w:val="0"/>
+        </w:numPr>
       </w:pPr>
       <w:r>
         <w:rPr>
@@ -363,6 +385,9 @@
         <w:spacing w:line="360" w:lineRule="auto" w:before="200" w:after="80"/>
         <w:ind w:firstLine="0"/>
         <w:jc w:val="left"/>
+        <w:numPr>
+          <w:numId w:val="0"/>
+        </w:numPr>
       </w:pPr>
       <w:r>
         <w:rPr>
@@ -384,7 +409,7 @@
           <w:rFonts w:ascii="Times New Roman" w:hAnsi="Times New Roman"/>
           <w:sz w:val="24"/>
         </w:rPr>
-        <w:t>La población o universo del presente estudio está conformada por la totalidad del personal directivo, ejecutivo, administrativo y técnico operativo adscrito a la Mancomunidad de Municipios Frontera del Norte, cuya sede central se ubica en el cantón Vista Hermosa del municipio de Santa Eulalia, departamento de Huehuetenango. Esta entidad asociativa regional ejerce jurisdicción y coordinación territorial sobre seis municipios miembros plenos del norte de Huehuetenango: San Juan Ixcoy, San Pedro Soloma, Santa Eulalia, San Sebastián Coatán, San Rafael La Independencia y San Miguel Acatán, incorporando además coordinaciones operativas con Santa Cruz Barillas y el municipio de Ixcán, perteneciente al departamento de Quiché.</w:t>
+        <w:t>La población o universo del presente estudio está conformada por la totalidad del personal directivo, ejecutivo, administrativo y técnico operativo adscrito a la Mancomunidad de Municipios Frontera del Norte, cuya sede central se ubica en el cantón Vista Hermosa del municipio de Santa Eulalia, departamento de Huehuetenango. Esta entidad asociativa regional ejerce jurisdicción y coordinación territorial sobre tres municipios activos miembros plenos del norte de Huehuetenango: San Juan Ixcoy, San Pedro Soloma, Santa Eulalia, San Sebastián Coatán, San Rafael La Independencia y San Miguel Acatán, incorporando además coordinaciones operativas con Santa Cruz Barillas y el municipio de Ixcán, perteneciente al departamento de Quiché.</w:t>
       </w:r>
     </w:p>
     <w:p>
@@ -407,6 +432,9 @@
         <w:spacing w:line="360" w:lineRule="auto" w:before="200" w:after="80"/>
         <w:ind w:firstLine="0"/>
         <w:jc w:val="left"/>
+        <w:numPr>
+          <w:numId w:val="0"/>
+        </w:numPr>
       </w:pPr>
       <w:r>
         <w:rPr>
@@ -499,6 +527,9 @@
         <w:spacing w:line="360" w:lineRule="auto" w:before="200" w:after="80"/>
         <w:ind w:firstLine="0"/>
         <w:jc w:val="left"/>
+        <w:numPr>
+          <w:numId w:val="0"/>
+        </w:numPr>
       </w:pPr>
       <w:r>
         <w:rPr>
@@ -1780,6 +1811,9 @@
         <w:spacing w:line="360" w:lineRule="auto" w:before="280" w:after="120"/>
         <w:ind w:firstLine="0"/>
         <w:jc w:val="left"/>
+        <w:numPr>
+          <w:numId w:val="0"/>
+        </w:numPr>
       </w:pPr>
       <w:r>
         <w:rPr>
@@ -1810,6 +1844,9 @@
         <w:spacing w:line="360" w:lineRule="auto" w:before="200" w:after="80"/>
         <w:ind w:firstLine="0"/>
         <w:jc w:val="left"/>
+        <w:numPr>
+          <w:numId w:val="0"/>
+        </w:numPr>
       </w:pPr>
       <w:r>
         <w:rPr>
@@ -1854,6 +1891,9 @@
         <w:spacing w:line="360" w:lineRule="auto" w:before="200" w:after="80"/>
         <w:ind w:firstLine="0"/>
         <w:jc w:val="left"/>
+        <w:numPr>
+          <w:numId w:val="0"/>
+        </w:numPr>
       </w:pPr>
       <w:r>
         <w:rPr>
@@ -1898,6 +1938,9 @@
         <w:spacing w:line="360" w:lineRule="auto" w:before="200" w:after="80"/>
         <w:ind w:firstLine="0"/>
         <w:jc w:val="left"/>
+        <w:numPr>
+          <w:numId w:val="0"/>
+        </w:numPr>
       </w:pPr>
       <w:r>
         <w:rPr>
@@ -3296,6 +3339,9 @@
         <w:spacing w:line="360" w:lineRule="auto" w:before="280" w:after="120"/>
         <w:ind w:firstLine="0"/>
         <w:jc w:val="left"/>
+        <w:numPr>
+          <w:numId w:val="0"/>
+        </w:numPr>
       </w:pPr>
       <w:r>
         <w:rPr>
@@ -3326,6 +3372,9 @@
         <w:spacing w:line="360" w:lineRule="auto" w:before="200" w:after="80"/>
         <w:ind w:firstLine="0"/>
         <w:jc w:val="left"/>
+        <w:numPr>
+          <w:numId w:val="0"/>
+        </w:numPr>
       </w:pPr>
       <w:r>
         <w:rPr>
@@ -3370,6 +3419,9 @@
         <w:spacing w:line="360" w:lineRule="auto" w:before="200" w:after="80"/>
         <w:ind w:firstLine="0"/>
         <w:jc w:val="left"/>
+        <w:numPr>
+          <w:numId w:val="0"/>
+        </w:numPr>
       </w:pPr>
       <w:r>
         <w:rPr>
@@ -3414,6 +3466,9 @@
         <w:spacing w:line="360" w:lineRule="auto" w:before="200" w:after="80"/>
         <w:ind w:firstLine="0"/>
         <w:jc w:val="left"/>
+        <w:numPr>
+          <w:numId w:val="0"/>
+        </w:numPr>
       </w:pPr>
       <w:r>
         <w:rPr>
@@ -3458,6 +3513,9 @@
         <w:spacing w:line="360" w:lineRule="auto" w:before="200" w:after="80"/>
         <w:ind w:firstLine="0"/>
         <w:jc w:val="left"/>
+        <w:numPr>
+          <w:numId w:val="0"/>
+        </w:numPr>
       </w:pPr>
       <w:r>
         <w:rPr>
@@ -4976,6 +5034,9 @@
         <w:spacing w:line="360" w:lineRule="auto" w:before="280" w:after="120"/>
         <w:ind w:firstLine="0"/>
         <w:jc w:val="left"/>
+        <w:numPr>
+          <w:numId w:val="0"/>
+        </w:numPr>
       </w:pPr>
       <w:r>
         <w:rPr>
@@ -5006,6 +5067,9 @@
         <w:spacing w:line="360" w:lineRule="auto" w:before="200" w:after="80"/>
         <w:ind w:firstLine="0"/>
         <w:jc w:val="left"/>
+        <w:numPr>
+          <w:numId w:val="0"/>
+        </w:numPr>
       </w:pPr>
       <w:r>
         <w:rPr>
@@ -5064,6 +5128,9 @@
         <w:spacing w:line="360" w:lineRule="auto" w:before="200" w:after="80"/>
         <w:ind w:firstLine="0"/>
         <w:jc w:val="left"/>
+        <w:numPr>
+          <w:numId w:val="0"/>
+        </w:numPr>
       </w:pPr>
       <w:r>
         <w:rPr>
@@ -5122,6 +5189,9 @@
         <w:spacing w:line="360" w:lineRule="auto" w:before="280" w:after="120"/>
         <w:ind w:firstLine="0"/>
         <w:jc w:val="left"/>
+        <w:numPr>
+          <w:numId w:val="0"/>
+        </w:numPr>
       </w:pPr>
       <w:r>
         <w:rPr>
@@ -5152,6 +5222,9 @@
         <w:spacing w:line="360" w:lineRule="auto" w:before="200" w:after="80"/>
         <w:ind w:firstLine="0"/>
         <w:jc w:val="left"/>
+        <w:numPr>
+          <w:numId w:val="0"/>
+        </w:numPr>
       </w:pPr>
       <w:r>
         <w:rPr>
@@ -5182,6 +5255,9 @@
         <w:spacing w:line="360" w:lineRule="auto" w:before="200" w:after="80"/>
         <w:ind w:firstLine="0"/>
         <w:jc w:val="left"/>
+        <w:numPr>
+          <w:numId w:val="0"/>
+        </w:numPr>
       </w:pPr>
       <w:r>
         <w:rPr>
@@ -5212,6 +5288,9 @@
         <w:spacing w:line="360" w:lineRule="auto" w:before="200" w:after="80"/>
         <w:ind w:firstLine="0"/>
         <w:jc w:val="left"/>
+        <w:numPr>
+          <w:numId w:val="0"/>
+        </w:numPr>
       </w:pPr>
       <w:r>
         <w:rPr>
@@ -5233,7 +5312,7 @@
           <w:rFonts w:ascii="Times New Roman" w:hAnsi="Times New Roman"/>
           <w:sz w:val="24"/>
         </w:rPr>
-        <w:t>La codificación de la plataforma se ejecuta mediante la metodología ágil Scrum complementada con tableros Kanban, organizada en ciclos de desarrollo iterativos e incrementales (sprints quincenales). Se programa el backend en arquitecturas robustas y eficientes (Go / Node.js) con el ORM Prisma para la conexión relacional segura, implementando servicios de autenticación mediante tokens JWT y mecanismos de autorización RBAC. En el frontend se construyen interfaces responsivas de carga ultrarrápida diseñadas bajo la filosofía Mobile-First para asegurar su correcta visualización tanto en equipos de escritorio de las oficinas centrales como en teléfonos inteligentes utilizados por los técnicos en comunidades rurales con conectividad limitada.</w:t>
+        <w:t>La codificación de la plataforma se ejecuta mediante la metodología ágil Scrum complementada con tableros Kanban, organizada en ciclos de desarrollo iterativos e incrementales (sprints quincenales). Se programa el backend en arquitecturas robustas y eficientes (Node.js con Express) con el ORM Prisma para la conexión relacional segura, implementando servicios de autenticación mediante tokens JWT y mecanismos de autorización RBAC. En el frontend se construyen interfaces responsivas de carga ultrarrápida diseñadas bajo la filosofía Mobile-First para asegurar su correcta visualización tanto en equipos de escritorio de las oficinas centrales como en teléfonos inteligentes utilizados por los técnicos en comunidades rurales con conectividad limitada.</w:t>
       </w:r>
     </w:p>
     <w:p>
@@ -5242,6 +5321,9 @@
         <w:spacing w:line="360" w:lineRule="auto" w:before="200" w:after="80"/>
         <w:ind w:firstLine="0"/>
         <w:jc w:val="left"/>
+        <w:numPr>
+          <w:numId w:val="0"/>
+        </w:numPr>
       </w:pPr>
       <w:r>
         <w:rPr>
@@ -5272,6 +5354,9 @@
         <w:spacing w:line="360" w:lineRule="auto" w:before="200" w:after="80"/>
         <w:ind w:firstLine="0"/>
         <w:jc w:val="left"/>
+        <w:numPr>
+          <w:numId w:val="0"/>
+        </w:numPr>
       </w:pPr>
       <w:r>
         <w:rPr>
@@ -5293,7 +5378,7 @@
           <w:rFonts w:ascii="Times New Roman" w:hAnsi="Times New Roman"/>
           <w:sz w:val="24"/>
         </w:rPr>
-        <w:t>Una vez alcanzada la certificación de calidad técnica, se realiza el despliegue del ecosistema en plataformas de computación en la nube de alta disponibilidad (Vercel para la capa visual y Fly.io para contenedores de API y base de datos relacional). Se procede a la digitalización y migración inicial de la información histórica crítica: actas de asambleas de Junta Directiva de los últimos períodos, convenios vigentes con cooperantes y estados de avance de proyectos intermunicipales de agua y saneamiento. De manera simultánea, se ejecutan talleres presenciales y virtuales de capacitación diferenciada dirigidos a los cinco perfiles de usuarios, haciendo entrega formal de los manuales ilustrados de usuario y las guías de administración técnica.</w:t>
+        <w:t>Una vez documentadas las verificaciones de calidad técnica, se planifica el despliegue del ecosistema en plataformas de computación en la nube de alta disponibilidad (Vercel para la capa visual y Fly.io para contenedores de API y base de datos relacional). Se procede a la digitalización y migración inicial de la información histórica crítica: actas de asambleas de Junta Directiva de los últimos períodos, convenios vigentes con cooperantes y estados de avance de proyectos intermunicipales de agua y saneamiento. De manera simultánea, se prevén talleres presenciales y virtuales de capacitación diferenciada dirigidos a los cinco perfiles de usuarios, haciendo entrega formal de los manuales ilustrados de usuario y las guías de administración técnica.</w:t>
       </w:r>
     </w:p>
     <w:p>
@@ -5302,6 +5387,9 @@
         <w:spacing w:line="360" w:lineRule="auto" w:before="200" w:after="80"/>
         <w:ind w:firstLine="0"/>
         <w:jc w:val="left"/>
+        <w:numPr>
+          <w:numId w:val="0"/>
+        </w:numPr>
       </w:pPr>
       <w:r>
         <w:rPr>
@@ -6327,6 +6415,9 @@
         <w:spacing w:line="360" w:lineRule="auto" w:before="280" w:after="120"/>
         <w:ind w:firstLine="0"/>
         <w:jc w:val="left"/>
+        <w:numPr>
+          <w:numId w:val="0"/>
+        </w:numPr>
       </w:pPr>
       <w:r>
         <w:rPr>
@@ -6357,6 +6448,9 @@
         <w:spacing w:line="360" w:lineRule="auto" w:before="200" w:after="80"/>
         <w:ind w:firstLine="0"/>
         <w:jc w:val="left"/>
+        <w:numPr>
+          <w:numId w:val="0"/>
+        </w:numPr>
       </w:pPr>
       <w:r>
         <w:rPr>
@@ -6401,6 +6495,9 @@
         <w:spacing w:line="360" w:lineRule="auto" w:before="200" w:after="80"/>
         <w:ind w:firstLine="0"/>
         <w:jc w:val="left"/>
+        <w:numPr>
+          <w:numId w:val="0"/>
+        </w:numPr>
       </w:pPr>
       <w:r>
         <w:rPr>
@@ -6436,7 +6533,7 @@
           <w:rFonts w:ascii="Times New Roman" w:hAnsi="Times New Roman"/>
           <w:sz w:val="24"/>
         </w:rPr>
-        <w:t>Con el propósito de seleccionar el estadístico de prueba inferencial adecuado, se evalúa previamente el supuesto de normalidad en la distribución de las diferencias mediante la prueba estadística de Shapiro-Wilk. Esta prueba resulta la más potente y recomendada metodológicamente cuando el tamaño muestral es menor a 30 observaciones (Shapiro &amp; Wilk, 1965). Si el valor de probabilidad obtenido en la prueba de normalidad resulta mayor al nivel de significancia prefijado (p &gt; 0.05), se confirma la distribución normal de los datos, procediendo a aplicar la prueba paramétrica t de Student para muestras emparejadas (relacionadas). Por el contrario, si los datos presentan una distribución asimétrica que viola el supuesto de normalidad (p &lt;= 0.05), se utiliza la prueba no paramétrica equivalente de Rangos con Signo de Wilcoxon para muestras relacionadas.</w:t>
+        <w:t>Con el propósito de seleccionar el estadístico de prueba inferencial adecuado, se evalúa previamente el supuesto de normalidad en la distribución de las diferencias mediante la prueba estadística de Shapiro-Wilk. Esta prueba resulta la más potente y recomendada metodológicamente cuando el tamaño muestral es menor a 30 observaciones (Shapiro &amp; Wilk, 1965). Si el valor de probabilidad obtenido en la prueba de normalidad resulta mayor al nivel de significancia prefijado (p &gt; 0.05), no se rechaza el supuesto de normalidad de las diferencias, procediendo a aplicar la prueba paramétrica t de Student para muestras emparejadas (relacionadas). Por el contrario, si los datos presentan una distribución asimétrica que viola el supuesto de normalidad (p &lt;= 0.05), se utiliza la prueba no paramétrica equivalente de Rangos con Signo de Wilcoxon para muestras relacionadas.</w:t>
       </w:r>
     </w:p>
     <w:p>
@@ -6450,7 +6547,7 @@
           <w:rFonts w:ascii="Times New Roman" w:hAnsi="Times New Roman"/>
           <w:sz w:val="24"/>
         </w:rPr>
-        <w:t>Para todas las pruebas inferenciales se establece un nivel de significancia alfa de 0.05 (confianza estadística del 95%). La regla de decisión metodológica determina que si el valor de significancia asintótica bilateral (p-valor) obtenido es estrictamente menor a 0.05 (p &lt; 0.05), se rechaza categóricamente la hipótesis nula (H0) y se acepta con validez científica la hipótesis de investigación (H1), concluyendo que la implantación del ecosistema web en la nube optimizó de manera estadísticamente significativa los tiempos de procesamiento y la eficiencia de la Mancomunidad. Adicionalmente, se calcula el tamaño del efecto mediante la d de Cohen para cuantificar la magnitud práctica del impacto tecnológico logrado.</w:t>
+        <w:t>Para todas las pruebas inferenciales se establece un nivel de significancia alfa de 0.05 (confianza estadística del 95%). La regla de decisión metodológica determina que si el valor de significancia de la prueba unilateral previamente definida (p-valor) obtenido es estrictamente menor a 0.05 (p &lt; 0.05), se rechaza categóricamente la hipótesis nula (H0) y se obtiene evidencia a favor de la hipótesis de investigación, dentro de las limitaciones del diseño (H1), concluyendo que la implantación del ecosistema web en la nube optimizó de manera estadísticamente significativa los tiempos de procesamiento y la eficiencia de la Mancomunidad. Adicionalmente, se calcula el tamaño del efecto mediante la d de Cohen para cuantificar la magnitud práctica del impacto tecnológico logrado.</w:t>
       </w:r>
     </w:p>
     <w:p>
@@ -6459,6 +6556,9 @@
         <w:spacing w:line="360" w:lineRule="auto" w:before="200" w:after="80"/>
         <w:ind w:firstLine="0"/>
         <w:jc w:val="left"/>
+        <w:numPr>
+          <w:numId w:val="0"/>
+        </w:numPr>
       </w:pPr>
       <w:r>
         <w:rPr>
@@ -6480,7 +6580,7 @@
           <w:rFonts w:ascii="Times New Roman" w:hAnsi="Times New Roman"/>
           <w:sz w:val="24"/>
         </w:rPr>
-        <w:t>Los datos generados automáticamente por la infraestructura en la nube se procesan mediante técnicas de minería de bitácoras (log analysis) y cuadros de mando de telemetría. Se extraen periódicamente los registros de solicitudes HTTP procesadas por el servidor, computando el percentil 95 (P95) y percentil 99 (P99) de los tiempos de latencia para evaluar la estabilidad del sistema ante cargas concurrentes. Asimismo, se filtran las alertas de disponibilidad emitidas por los monitores externos de infraestructura para certificar matemáticamente el cumplimiento del acuerdo de nivel de servicio (SLA) del 99.9% de Uptime. En materia de seguridad, se auditan los intentos fallidos de autenticación y transacciones no autorizadas registradas en la base de datos relacional, demostrando la solidez defensiva del control RBAC frente a incidentes informáticos.</w:t>
+        <w:t>Los datos generados automáticamente por la infraestructura en la nube se procesan mediante técnicas de minería de bitácoras (log analysis) y cuadros de mando de telemetría. Se extraen periódicamente los registros de solicitudes HTTP procesadas por el servidor, computando el percentil 95 (P95) y percentil 99 (P99) de los tiempos de latencia para evaluar la estabilidad del sistema ante cargas concurrentes. Asimismo, se filtran las alertas de disponibilidad emitidas por los monitores externos de infraestructura para evaluar si se cumple el objetivo de disponibilidad del 99.9% durante el período definido, sin darlo por demostrado antes de medirlo. En materia de seguridad, se auditan los intentos fallidos de autenticación y transacciones no autorizadas registradas en la base de datos relacional, evaluando el comportamiento del control RBAC frente a intentos no autorizados.</w:t>
       </w:r>
     </w:p>
     <w:p>
@@ -6489,6 +6589,9 @@
         <w:spacing w:line="360" w:lineRule="auto" w:before="200" w:after="80"/>
         <w:ind w:firstLine="0"/>
         <w:jc w:val="left"/>
+        <w:numPr>
+          <w:numId w:val="0"/>
+        </w:numPr>
       </w:pPr>
       <w:r>
         <w:rPr>
@@ -7130,6 +7233,9 @@
         <w:spacing w:line="360" w:lineRule="auto" w:before="280" w:after="120"/>
         <w:ind w:firstLine="0"/>
         <w:jc w:val="left"/>
+        <w:numPr>
+          <w:numId w:val="0"/>
+        </w:numPr>
       </w:pPr>
       <w:r>
         <w:rPr>
@@ -7160,6 +7266,9 @@
         <w:spacing w:line="360" w:lineRule="auto" w:before="200" w:after="80"/>
         <w:ind w:firstLine="0"/>
         <w:jc w:val="left"/>
+        <w:numPr>
+          <w:numId w:val="0"/>
+        </w:numPr>
       </w:pPr>
       <w:r>
         <w:rPr>
@@ -7190,6 +7299,9 @@
         <w:spacing w:line="360" w:lineRule="auto" w:before="200" w:after="80"/>
         <w:ind w:firstLine="0"/>
         <w:jc w:val="left"/>
+        <w:numPr>
+          <w:numId w:val="0"/>
+        </w:numPr>
       </w:pPr>
       <w:r>
         <w:rPr>
@@ -7220,6 +7332,9 @@
         <w:spacing w:line="360" w:lineRule="auto" w:before="200" w:after="80"/>
         <w:ind w:firstLine="0"/>
         <w:jc w:val="left"/>
+        <w:numPr>
+          <w:numId w:val="0"/>
+        </w:numPr>
       </w:pPr>
       <w:r>
         <w:rPr>
@@ -7615,6 +7730,52 @@
           <w:sz w:val="24"/>
         </w:rPr>
         <w:t>Lineamientos generales y reglamento de tesis de la Facultad de Ingeniería en Sistemas de Información y Ciencias de la Computación. UMG.</w:t>
+      </w:r>
+    </w:p>
+    <w:p>
+      <w:r/>
+    </w:p>
+    <w:p>
+      <w:pPr>
+        <w:pStyle w:val="Ttulo1"/>
+      </w:pPr>
+      <w:r>
+        <w:t>Estado de implementación y límites de la investigación</w:t>
+      </w:r>
+    </w:p>
+    <w:p>
+      <w:r>
+        <w:t>MFN Digital comprende siete módulos funcionales del alcance de investigación: proyectos, ARC, finanzas, gobernanza, convenios, indicadores ASH y transparencia. Autenticación y permisos son transversales. Talento humano e inteligencia territorial son extensiones del prototipo y no amplían automáticamente el alcance aprobado.</w:t>
+      </w:r>
+    </w:p>
+    <w:p>
+      <w:r>
+        <w:t>La implementación revisada utiliza Svelte 5, SvelteKit 2, Node.js, Express 4 y Prisma 6. SQLite se utiliza para desarrollo; PostgreSQL cuenta con un esquema y un SQL de actualización separados. Go se reserva como alternativa futura. Los diagramas o antecedentes que indiquen Go o servicios externos de archivos describen una propuesta anterior y no acreditan una integración implementada.</w:t>
+      </w:r>
+    </w:p>
+    <w:p>
+      <w:r>
+        <w:t>Las evidencias nuevas conservan el archivo PNG o JPEG y su huella SHA-256 en la base de datos. Las coordenadas son suministradas por el dispositivo cliente; no se garantiza precisión satelital ni ubicación auténtica. No se implementa extracción EXIF, integración CommCare ni sincronización sin conexión en esta versión.</w:t>
+      </w:r>
+    </w:p>
+    <w:p>
+      <w:r>
+        <w:t>Las escrituras de los nueve modelos operativos incluidos en el control de integridad y sus eventos antes/después se confirman en una misma transacción. El control compara registros completos con puntos históricos y rechaza sellar discrepancias. Es una verificación interna; no es una certificación de la CGC ni una garantía de inmutabilidad frente al administrador de la base.</w:t>
+      </w:r>
+    </w:p>
+    <w:p>
+      <w:r>
+        <w:t>La reducción de tiempos, satisfacción, disponibilidad y rendimiento son indicadores a medir. No se presentan como resultados demostrados. El diseño principal es pre-experimental de un solo grupo con mediciones pareadas antes y después; la encuesta posterior es descriptiva transversal. Se deben conservar los datos, fechas, tareas comparables y limitaciones de atribución causal.</w:t>
+      </w:r>
+    </w:p>
+    <w:p>
+      <w:r>
+        <w:t>La muestra propuesta de 22 participantes requiere padrón y consentimientos actualizados. Los municipios activos son San Pedro Soloma, Santa Eulalia y San Rafael la Independencia, según el PG y la confirmación del responsable (3 de octubre de 2026). Las otras localidades corresponden a antecedentes históricos.</w:t>
+      </w:r>
+    </w:p>
+    <w:p>
+      <w:r>
+        <w:t>El índice IPIM es una orientación preliminar con pesos que requieren validación institucional. La ausencia de datos se identifica como información insuficiente. El índice no emite decisiones vinculantes ni demuestra ausencia de sesgos.</w:t>
       </w:r>
     </w:p>
     <w:sectPr>

</xml_diff>